<commit_message>
RAPPORT À LIRE EVA
Ajout du rapport en .md et avec rédaction (presentation.md) et de la présentation du README.
</commit_message>
<xml_diff>
--- a/Presentation.docx
+++ b/Presentation.docx
@@ -1,6 +1,6 @@
 
 <file path=word/document.xml><?xml version="1.0" encoding="utf-8"?>
-<w:document xmlns:wpc="http://schemas.microsoft.com/office/word/2010/wordprocessingCanvas" xmlns:cx="http://schemas.microsoft.com/office/drawing/2014/chartex" xmlns:cx1="http://schemas.microsoft.com/office/drawing/2015/9/8/chartex" xmlns:cx2="http://schemas.microsoft.com/office/drawing/2015/10/21/chartex" xmlns:cx3="http://schemas.microsoft.com/office/drawing/2016/5/9/chartex" xmlns:cx4="http://schemas.microsoft.com/office/drawing/2016/5/10/chartex" xmlns:cx5="http://schemas.microsoft.com/office/drawing/2016/5/11/chartex" xmlns:cx6="http://schemas.microsoft.com/office/drawing/2016/5/12/chartex" xmlns:cx7="http://schemas.microsoft.com/office/drawing/2016/5/13/chartex" xmlns:cx8="http://schemas.microsoft.com/office/drawing/2016/5/14/chartex" xmlns:mc="http://schemas.openxmlformats.org/markup-compatibility/2006" xmlns:aink="http://schemas.microsoft.com/office/drawing/2016/ink" xmlns:am3d="http://schemas.microsoft.com/office/drawing/2017/model3d" xmlns:o="urn:schemas-microsoft-com:office:office" xmlns:r="http://schemas.openxmlformats.org/officeDocument/2006/relationships" xmlns:m="http://schemas.openxmlformats.org/officeDocument/2006/math" xmlns:v="urn:schemas-microsoft-com:vml" xmlns:wp14="http://schemas.microsoft.com/office/word/2010/wordprocessingDrawing" xmlns:wp="http://schemas.openxmlformats.org/drawingml/2006/wordprocessingDrawing" xmlns:w10="urn:schemas-microsoft-com:office:word" xmlns:w="http://schemas.openxmlformats.org/wordprocessingml/2006/main" xmlns:w14="http://schemas.microsoft.com/office/word/2010/wordml" xmlns:w15="http://schemas.microsoft.com/office/word/2012/wordml" xmlns:w16cex="http://schemas.microsoft.com/office/word/2018/wordml/cex" xmlns:w16cid="http://schemas.microsoft.com/office/word/2016/wordml/cid" xmlns:w16="http://schemas.microsoft.com/office/word/2018/wordml" xmlns:w16sdtdh="http://schemas.microsoft.com/office/word/2020/wordml/sdtdatahash" xmlns:w16se="http://schemas.microsoft.com/office/word/2015/wordml/symex" xmlns:wpg="http://schemas.microsoft.com/office/word/2010/wordprocessingGroup" xmlns:wpi="http://schemas.microsoft.com/office/word/2010/wordprocessingInk" xmlns:wne="http://schemas.microsoft.com/office/word/2006/wordml" xmlns:wps="http://schemas.microsoft.com/office/word/2010/wordprocessingShape" mc:Ignorable="w14 w15 w16se w16cid w16 w16cex w16sdtdh wp14">
+<w:document xmlns:wpc="http://schemas.microsoft.com/office/word/2010/wordprocessingCanvas" xmlns:cx="http://schemas.microsoft.com/office/drawing/2014/chartex" xmlns:cx1="http://schemas.microsoft.com/office/drawing/2015/9/8/chartex" xmlns:cx2="http://schemas.microsoft.com/office/drawing/2015/10/21/chartex" xmlns:cx3="http://schemas.microsoft.com/office/drawing/2016/5/9/chartex" xmlns:cx4="http://schemas.microsoft.com/office/drawing/2016/5/10/chartex" xmlns:cx5="http://schemas.microsoft.com/office/drawing/2016/5/11/chartex" xmlns:cx6="http://schemas.microsoft.com/office/drawing/2016/5/12/chartex" xmlns:cx7="http://schemas.microsoft.com/office/drawing/2016/5/13/chartex" xmlns:cx8="http://schemas.microsoft.com/office/drawing/2016/5/14/chartex" xmlns:mc="http://schemas.openxmlformats.org/markup-compatibility/2006" xmlns:aink="http://schemas.microsoft.com/office/drawing/2016/ink" xmlns:am3d="http://schemas.microsoft.com/office/drawing/2017/model3d" xmlns:o="urn:schemas-microsoft-com:office:office" xmlns:oel="http://schemas.microsoft.com/office/2019/extlst" xmlns:r="http://schemas.openxmlformats.org/officeDocument/2006/relationships" xmlns:m="http://schemas.openxmlformats.org/officeDocument/2006/math" xmlns:v="urn:schemas-microsoft-com:vml" xmlns:wp14="http://schemas.microsoft.com/office/word/2010/wordprocessingDrawing" xmlns:wp="http://schemas.openxmlformats.org/drawingml/2006/wordprocessingDrawing" xmlns:w10="urn:schemas-microsoft-com:office:word" xmlns:w="http://schemas.openxmlformats.org/wordprocessingml/2006/main" xmlns:w14="http://schemas.microsoft.com/office/word/2010/wordml" xmlns:w15="http://schemas.microsoft.com/office/word/2012/wordml" xmlns:w16cex="http://schemas.microsoft.com/office/word/2018/wordml/cex" xmlns:w16cid="http://schemas.microsoft.com/office/word/2016/wordml/cid" xmlns:w16="http://schemas.microsoft.com/office/word/2018/wordml" xmlns:w16du="http://schemas.microsoft.com/office/word/2023/wordml/word16du" xmlns:w16sdtdh="http://schemas.microsoft.com/office/word/2020/wordml/sdtdatahash" xmlns:w16sdtfl="http://schemas.microsoft.com/office/word/2024/wordml/sdtformatlock" xmlns:w16se="http://schemas.microsoft.com/office/word/2015/wordml/symex" xmlns:wpg="http://schemas.microsoft.com/office/word/2010/wordprocessingGroup" xmlns:wpi="http://schemas.microsoft.com/office/word/2010/wordprocessingInk" xmlns:wne="http://schemas.microsoft.com/office/word/2006/wordml" xmlns:wps="http://schemas.microsoft.com/office/word/2010/wordprocessingShape" mc:Ignorable="w14 w15 w16se w16cid w16 w16cex w16sdtdh w16sdtfl w16du wp14">
   <w:body>
     <w:p>
       <w:r>
@@ -546,10 +546,28 @@
         </w:numPr>
       </w:pPr>
       <w:r>
-        <w:t>Continuation du programme</w:t>
-      </w:r>
-      <w:r>
-        <w:t xml:space="preserve"> et production des dessins et du scenario</w:t>
+        <w:t>Poursuite</w:t>
+      </w:r>
+      <w:r>
+        <w:t xml:space="preserve"> </w:t>
+      </w:r>
+      <w:r>
+        <w:t>de la</w:t>
+      </w:r>
+      <w:r>
+        <w:t xml:space="preserve"> programm</w:t>
+      </w:r>
+      <w:r>
+        <w:t>ation</w:t>
+      </w:r>
+      <w:r>
+        <w:t xml:space="preserve"> et</w:t>
+      </w:r>
+      <w:r>
+        <w:t xml:space="preserve"> de la </w:t>
+      </w:r>
+      <w:r>
+        <w:t xml:space="preserve"> production des dessins et du scenario</w:t>
       </w:r>
     </w:p>
     <w:p>
@@ -637,13 +655,106 @@
         </w:numPr>
       </w:pPr>
       <w:r>
-        <w:t xml:space="preserve">(Javascript </w:t>
-      </w:r>
-      <w:r>
-        <w:t>passage</w:t>
-      </w:r>
-      <w:r>
-        <w:t>), passage d</w:t>
+        <w:t>(</w:t>
+      </w:r>
+      <w:r>
+        <w:t>Pour transférer le projet d’un modèle web à un modèle python nous avons procédé en plusieurs étapes :</w:t>
+      </w:r>
+    </w:p>
+    <w:p>
+      <w:pPr>
+        <w:pStyle w:val="Paragraphedeliste"/>
+        <w:numPr>
+          <w:ilvl w:val="1"/>
+          <w:numId w:val="2"/>
+        </w:numPr>
+      </w:pPr>
+      <w:r>
+        <w:t>Relire la structuration du code : Le projet étant en web il se composé de trois type</w:t>
+      </w:r>
+      <w:r>
+        <w:t>s</w:t>
+      </w:r>
+      <w:r>
+        <w:t xml:space="preserve"> de fichiers (HTML, JavaScript et CSS), ainsi nous avons gardé une logique similaire dans le transfert vers python : </w:t>
+      </w:r>
+    </w:p>
+    <w:p>
+      <w:pPr>
+        <w:pStyle w:val="Paragraphedeliste"/>
+        <w:numPr>
+          <w:ilvl w:val="2"/>
+          <w:numId w:val="2"/>
+        </w:numPr>
+      </w:pPr>
+      <w:r>
+        <w:t>Un fichier qui rassemble les palettes de données et la gestion des informations : dossier « data » -&gt; datacenter.py</w:t>
+      </w:r>
+    </w:p>
+    <w:p>
+      <w:pPr>
+        <w:pStyle w:val="Paragraphedeliste"/>
+        <w:numPr>
+          <w:ilvl w:val="2"/>
+          <w:numId w:val="2"/>
+        </w:numPr>
+      </w:pPr>
+      <w:r>
+        <w:t>Un fichier qui rassemble les couleurs du jeu et quelques styles : global.css -&gt; style.py</w:t>
+      </w:r>
+    </w:p>
+    <w:p>
+      <w:pPr>
+        <w:pStyle w:val="Paragraphedeliste"/>
+        <w:numPr>
+          <w:ilvl w:val="2"/>
+          <w:numId w:val="2"/>
+        </w:numPr>
+      </w:pPr>
+      <w:r>
+        <w:t>Les fichiers qui s’occupent de l’affichage des données de façon utilisable par le joueur : dossier « screens » -&gt; leafsHome.py + shopHome.py + inventoryHome.py. L’interface de planetHome n’étant pas encore implémenté à cette époque nous n’avons pas eu besoin de faire le transfert</w:t>
+      </w:r>
+    </w:p>
+    <w:p>
+      <w:pPr>
+        <w:pStyle w:val="Paragraphedeliste"/>
+        <w:numPr>
+          <w:ilvl w:val="1"/>
+          <w:numId w:val="2"/>
+        </w:numPr>
+      </w:pPr>
+      <w:r>
+        <w:t xml:space="preserve">Trouver un module viable : Nous étions parties sur l’idée d’utilisé pygame dès le début du projet mais nous avions abandonné au vu des limitations qu’il pouvait présenter. Nous avons donc opté pour une interface graphique initialement dédiés à des simples fenêtres graphiques, car ce fut la solution qui se rapprochait le plus d’un </w:t>
+      </w:r>
+      <w:r>
+        <w:lastRenderedPageBreak/>
+        <w:t>codage web. Cette solution nous a éviter de prendre trop de temps à reprendre en main un nouveau support pour coder.</w:t>
+      </w:r>
+    </w:p>
+    <w:p>
+      <w:pPr>
+        <w:pStyle w:val="Paragraphedeliste"/>
+      </w:pPr>
+      <w:r>
+        <w:t>Nous avons ainsi réussi à transférer l’ensemble du projet d’un modèle web à un modèle python.</w:t>
+      </w:r>
+      <w:r>
+        <w:t>)</w:t>
+      </w:r>
+    </w:p>
+    <w:p>
+      <w:pPr>
+        <w:pStyle w:val="Paragraphedeliste"/>
+        <w:numPr>
+          <w:ilvl w:val="0"/>
+          <w:numId w:val="2"/>
+        </w:numPr>
+      </w:pPr>
+      <w:r>
+        <w:t>P</w:t>
+      </w:r>
+      <w:r>
+        <w:t>assage d</w:t>
       </w:r>
       <w:r>
         <w:t>’</w:t>
@@ -705,7 +816,7 @@
 </file>
 
 <file path=word/numbering.xml><?xml version="1.0" encoding="utf-8"?>
-<w:numbering xmlns:wpc="http://schemas.microsoft.com/office/word/2010/wordprocessingCanvas" xmlns:cx="http://schemas.microsoft.com/office/drawing/2014/chartex" xmlns:cx1="http://schemas.microsoft.com/office/drawing/2015/9/8/chartex" xmlns:cx2="http://schemas.microsoft.com/office/drawing/2015/10/21/chartex" xmlns:cx3="http://schemas.microsoft.com/office/drawing/2016/5/9/chartex" xmlns:cx4="http://schemas.microsoft.com/office/drawing/2016/5/10/chartex" xmlns:cx5="http://schemas.microsoft.com/office/drawing/2016/5/11/chartex" xmlns:cx6="http://schemas.microsoft.com/office/drawing/2016/5/12/chartex" xmlns:cx7="http://schemas.microsoft.com/office/drawing/2016/5/13/chartex" xmlns:cx8="http://schemas.microsoft.com/office/drawing/2016/5/14/chartex" xmlns:mc="http://schemas.openxmlformats.org/markup-compatibility/2006" xmlns:aink="http://schemas.microsoft.com/office/drawing/2016/ink" xmlns:am3d="http://schemas.microsoft.com/office/drawing/2017/model3d" xmlns:o="urn:schemas-microsoft-com:office:office" xmlns:r="http://schemas.openxmlformats.org/officeDocument/2006/relationships" xmlns:m="http://schemas.openxmlformats.org/officeDocument/2006/math" xmlns:v="urn:schemas-microsoft-com:vml" xmlns:wp14="http://schemas.microsoft.com/office/word/2010/wordprocessingDrawing" xmlns:wp="http://schemas.openxmlformats.org/drawingml/2006/wordprocessingDrawing" xmlns:w10="urn:schemas-microsoft-com:office:word" xmlns:w="http://schemas.openxmlformats.org/wordprocessingml/2006/main" xmlns:w14="http://schemas.microsoft.com/office/word/2010/wordml" xmlns:w15="http://schemas.microsoft.com/office/word/2012/wordml" xmlns:w16cex="http://schemas.microsoft.com/office/word/2018/wordml/cex" xmlns:w16cid="http://schemas.microsoft.com/office/word/2016/wordml/cid" xmlns:w16="http://schemas.microsoft.com/office/word/2018/wordml" xmlns:w16sdtdh="http://schemas.microsoft.com/office/word/2020/wordml/sdtdatahash" xmlns:w16se="http://schemas.microsoft.com/office/word/2015/wordml/symex" xmlns:wpg="http://schemas.microsoft.com/office/word/2010/wordprocessingGroup" xmlns:wpi="http://schemas.microsoft.com/office/word/2010/wordprocessingInk" xmlns:wne="http://schemas.microsoft.com/office/word/2006/wordml" xmlns:wps="http://schemas.microsoft.com/office/word/2010/wordprocessingShape" mc:Ignorable="w14 w15 w16se w16cid w16 w16cex w16sdtdh wp14">
+<w:numbering xmlns:wpc="http://schemas.microsoft.com/office/word/2010/wordprocessingCanvas" xmlns:cx="http://schemas.microsoft.com/office/drawing/2014/chartex" xmlns:cx1="http://schemas.microsoft.com/office/drawing/2015/9/8/chartex" xmlns:cx2="http://schemas.microsoft.com/office/drawing/2015/10/21/chartex" xmlns:cx3="http://schemas.microsoft.com/office/drawing/2016/5/9/chartex" xmlns:cx4="http://schemas.microsoft.com/office/drawing/2016/5/10/chartex" xmlns:cx5="http://schemas.microsoft.com/office/drawing/2016/5/11/chartex" xmlns:cx6="http://schemas.microsoft.com/office/drawing/2016/5/12/chartex" xmlns:cx7="http://schemas.microsoft.com/office/drawing/2016/5/13/chartex" xmlns:cx8="http://schemas.microsoft.com/office/drawing/2016/5/14/chartex" xmlns:mc="http://schemas.openxmlformats.org/markup-compatibility/2006" xmlns:aink="http://schemas.microsoft.com/office/drawing/2016/ink" xmlns:am3d="http://schemas.microsoft.com/office/drawing/2017/model3d" xmlns:o="urn:schemas-microsoft-com:office:office" xmlns:oel="http://schemas.microsoft.com/office/2019/extlst" xmlns:r="http://schemas.openxmlformats.org/officeDocument/2006/relationships" xmlns:m="http://schemas.openxmlformats.org/officeDocument/2006/math" xmlns:v="urn:schemas-microsoft-com:vml" xmlns:wp14="http://schemas.microsoft.com/office/word/2010/wordprocessingDrawing" xmlns:wp="http://schemas.openxmlformats.org/drawingml/2006/wordprocessingDrawing" xmlns:w10="urn:schemas-microsoft-com:office:word" xmlns:w="http://schemas.openxmlformats.org/wordprocessingml/2006/main" xmlns:w14="http://schemas.microsoft.com/office/word/2010/wordml" xmlns:w15="http://schemas.microsoft.com/office/word/2012/wordml" xmlns:w16cex="http://schemas.microsoft.com/office/word/2018/wordml/cex" xmlns:w16cid="http://schemas.microsoft.com/office/word/2016/wordml/cid" xmlns:w16="http://schemas.microsoft.com/office/word/2018/wordml" xmlns:w16du="http://schemas.microsoft.com/office/word/2023/wordml/word16du" xmlns:w16sdtdh="http://schemas.microsoft.com/office/word/2020/wordml/sdtdatahash" xmlns:w16sdtfl="http://schemas.microsoft.com/office/word/2024/wordml/sdtformatlock" xmlns:w16se="http://schemas.microsoft.com/office/word/2015/wordml/symex" xmlns:wpg="http://schemas.microsoft.com/office/word/2010/wordprocessingGroup" xmlns:wpi="http://schemas.microsoft.com/office/word/2010/wordprocessingInk" xmlns:wne="http://schemas.microsoft.com/office/word/2006/wordml" xmlns:wps="http://schemas.microsoft.com/office/word/2010/wordprocessingShape" mc:Ignorable="w14 w15 w16se w16cid w16 w16cex w16sdtdh w16sdtfl w16du wp14">
   <w:abstractNum w:abstractNumId="0" w15:restartNumberingAfterBreak="0">
     <w:nsid w:val="3EC13421"/>
     <w:multiLevelType w:val="hybridMultilevel"/>
@@ -721,7 +832,7 @@
         <w:rFonts w:ascii="Calibri" w:eastAsiaTheme="minorHAnsi" w:hAnsi="Calibri" w:cs="Calibri" w:hint="default"/>
       </w:rPr>
     </w:lvl>
-    <w:lvl w:ilvl="1" w:tplc="040C0003" w:tentative="1">
+    <w:lvl w:ilvl="1" w:tplc="040C0003">
       <w:start w:val="1"/>
       <w:numFmt w:val="bullet"/>
       <w:lvlText w:val="o"/>
@@ -733,7 +844,7 @@
         <w:rFonts w:ascii="Courier New" w:hAnsi="Courier New" w:cs="Courier New" w:hint="default"/>
       </w:rPr>
     </w:lvl>
-    <w:lvl w:ilvl="2" w:tplc="040C0005" w:tentative="1">
+    <w:lvl w:ilvl="2" w:tplc="040C0005">
       <w:start w:val="1"/>
       <w:numFmt w:val="bullet"/>
       <w:lvlText w:val=""/>
@@ -1042,20 +1153,20 @@
       </w:rPr>
     </w:lvl>
   </w:abstractNum>
-  <w:num w:numId="1">
+  <w:num w:numId="1" w16cid:durableId="619989948">
     <w:abstractNumId w:val="2"/>
   </w:num>
-  <w:num w:numId="2">
+  <w:num w:numId="2" w16cid:durableId="1385837773">
     <w:abstractNumId w:val="0"/>
   </w:num>
-  <w:num w:numId="3">
+  <w:num w:numId="3" w16cid:durableId="1372262105">
     <w:abstractNumId w:val="1"/>
   </w:num>
 </w:numbering>
 </file>
 
 <file path=word/styles.xml><?xml version="1.0" encoding="utf-8"?>
-<w:styles xmlns:mc="http://schemas.openxmlformats.org/markup-compatibility/2006" xmlns:r="http://schemas.openxmlformats.org/officeDocument/2006/relationships" xmlns:w="http://schemas.openxmlformats.org/wordprocessingml/2006/main" xmlns:w14="http://schemas.microsoft.com/office/word/2010/wordml" xmlns:w15="http://schemas.microsoft.com/office/word/2012/wordml" xmlns:w16cex="http://schemas.microsoft.com/office/word/2018/wordml/cex" xmlns:w16cid="http://schemas.microsoft.com/office/word/2016/wordml/cid" xmlns:w16="http://schemas.microsoft.com/office/word/2018/wordml" xmlns:w16sdtdh="http://schemas.microsoft.com/office/word/2020/wordml/sdtdatahash" xmlns:w16se="http://schemas.microsoft.com/office/word/2015/wordml/symex" mc:Ignorable="w14 w15 w16se w16cid w16 w16cex w16sdtdh">
+<w:styles xmlns:mc="http://schemas.openxmlformats.org/markup-compatibility/2006" xmlns:r="http://schemas.openxmlformats.org/officeDocument/2006/relationships" xmlns:w="http://schemas.openxmlformats.org/wordprocessingml/2006/main" xmlns:w14="http://schemas.microsoft.com/office/word/2010/wordml" xmlns:w15="http://schemas.microsoft.com/office/word/2012/wordml" xmlns:w16cex="http://schemas.microsoft.com/office/word/2018/wordml/cex" xmlns:w16cid="http://schemas.microsoft.com/office/word/2016/wordml/cid" xmlns:w16="http://schemas.microsoft.com/office/word/2018/wordml" xmlns:w16du="http://schemas.microsoft.com/office/word/2023/wordml/word16du" xmlns:w16sdtdh="http://schemas.microsoft.com/office/word/2020/wordml/sdtdatahash" xmlns:w16sdtfl="http://schemas.microsoft.com/office/word/2024/wordml/sdtformatlock" xmlns:w16se="http://schemas.microsoft.com/office/word/2015/wordml/symex" mc:Ignorable="w14 w15 w16se w16cid w16 w16cex w16sdtdh w16sdtfl w16du">
   <w:docDefaults>
     <w:rPrDefault>
       <w:rPr>

</xml_diff>